<commit_message>
Update course materials and add Java programs
</commit_message>
<xml_diff>
--- a/TYBCA/Introduction To Cloud Computing/Lecture Notes.docx
+++ b/TYBCA/Introduction To Cloud Computing/Lecture Notes.docx
@@ -164,7 +164,7 @@
     <w:p>
       <w:r>
         <w:pict w14:anchorId="0AE0B42D">
-          <v:rect id="_x0000_i1097" style="width:0;height:1.5pt" o:hralign="center" o:hrstd="t" o:hr="t" fillcolor="#a0a0a0" stroked="f"/>
+          <v:rect id="_x0000_i1026" style="width:0;height:1.5pt" o:hralign="center" o:hrstd="t" o:hr="t" fillcolor="#a0a0a0" stroked="f"/>
         </w:pict>
       </w:r>
     </w:p>
@@ -351,7 +351,7 @@
     <w:p>
       <w:r>
         <w:pict w14:anchorId="696CC75C">
-          <v:rect id="_x0000_i1098" style="width:0;height:1.5pt" o:hralign="center" o:hrstd="t" o:hr="t" fillcolor="#a0a0a0" stroked="f"/>
+          <v:rect id="_x0000_i1027" style="width:0;height:1.5pt" o:hralign="center" o:hrstd="t" o:hr="t" fillcolor="#a0a0a0" stroked="f"/>
         </w:pict>
       </w:r>
     </w:p>
@@ -440,7 +440,7 @@
     <w:p>
       <w:r>
         <w:pict w14:anchorId="0D290A4A">
-          <v:rect id="_x0000_i1099" style="width:0;height:1.5pt" o:hralign="center" o:hrstd="t" o:hr="t" fillcolor="#a0a0a0" stroked="f"/>
+          <v:rect id="_x0000_i1028" style="width:0;height:1.5pt" o:hralign="center" o:hrstd="t" o:hr="t" fillcolor="#a0a0a0" stroked="f"/>
         </w:pict>
       </w:r>
     </w:p>
@@ -503,13 +503,73 @@
         <w:t xml:space="preserve">Scalable </w:t>
       </w:r>
     </w:p>
+    <w:p/>
+    <w:p/>
+    <w:p>
+      <w:r>
+        <w:rPr>
+          <w:noProof/>
+        </w:rPr>
+        <w:drawing>
+          <wp:inline distT="0" distB="0" distL="0" distR="0" wp14:anchorId="760A5112" wp14:editId="6909DBED">
+            <wp:extent cx="6140450" cy="2355850"/>
+            <wp:effectExtent l="0" t="0" r="0" b="6350"/>
+            <wp:docPr id="1823333248" name="Picture 1" descr="Main cloud service models: IaaS, PaaS and SaaS"/>
+            <wp:cNvGraphicFramePr>
+              <a:graphicFrameLocks xmlns:a="http://schemas.openxmlformats.org/drawingml/2006/main" noChangeAspect="1"/>
+            </wp:cNvGraphicFramePr>
+            <a:graphic xmlns:a="http://schemas.openxmlformats.org/drawingml/2006/main">
+              <a:graphicData uri="http://schemas.openxmlformats.org/drawingml/2006/picture">
+                <pic:pic xmlns:pic="http://schemas.openxmlformats.org/drawingml/2006/picture">
+                  <pic:nvPicPr>
+                    <pic:cNvPr id="0" name="Picture 8" descr="Main cloud service models: IaaS, PaaS and SaaS"/>
+                    <pic:cNvPicPr>
+                      <a:picLocks noChangeAspect="1" noChangeArrowheads="1"/>
+                    </pic:cNvPicPr>
+                  </pic:nvPicPr>
+                  <pic:blipFill>
+                    <a:blip r:embed="rId5">
+                      <a:extLst>
+                        <a:ext uri="{28A0092B-C50C-407E-A947-70E740481C1C}">
+                          <a14:useLocalDpi xmlns:a14="http://schemas.microsoft.com/office/drawing/2010/main" val="0"/>
+                        </a:ext>
+                      </a:extLst>
+                    </a:blip>
+                    <a:srcRect/>
+                    <a:stretch>
+                      <a:fillRect/>
+                    </a:stretch>
+                  </pic:blipFill>
+                  <pic:spPr bwMode="auto">
+                    <a:xfrm>
+                      <a:off x="0" y="0"/>
+                      <a:ext cx="6140450" cy="2355850"/>
+                    </a:xfrm>
+                    <a:prstGeom prst="rect">
+                      <a:avLst/>
+                    </a:prstGeom>
+                    <a:noFill/>
+                    <a:ln>
+                      <a:noFill/>
+                    </a:ln>
+                  </pic:spPr>
+                </pic:pic>
+              </a:graphicData>
+            </a:graphic>
+          </wp:inline>
+        </w:drawing>
+      </w:r>
+    </w:p>
+    <w:p/>
+    <w:p/>
     <w:p>
       <w:r>
         <w:pict w14:anchorId="7A7C61A4">
-          <v:rect id="_x0000_i1112" style="width:0;height:1.5pt" o:hralign="center" o:hrstd="t" o:hr="t" fillcolor="#a0a0a0" stroked="f"/>
+          <v:rect id="_x0000_i1029" style="width:0;height:1.5pt" o:hralign="center" o:bullet="t" o:hrstd="t" o:hr="t" fillcolor="#a0a0a0" stroked="f"/>
         </w:pict>
       </w:r>
     </w:p>
+    <w:p/>
     <w:p>
       <w:pPr>
         <w:jc w:val="center"/>
@@ -545,6 +605,7 @@
         <w:rPr>
           <w:b/>
           <w:bCs/>
+          <w:noProof/>
         </w:rPr>
         <w:drawing>
           <wp:inline distT="0" distB="0" distL="0" distR="0" wp14:anchorId="6C53C307" wp14:editId="59B77B24">
@@ -562,7 +623,7 @@
                     <pic:cNvPicPr/>
                   </pic:nvPicPr>
                   <pic:blipFill>
-                    <a:blip r:embed="rId5"/>
+                    <a:blip r:embed="rId6"/>
                     <a:stretch>
                       <a:fillRect/>
                     </a:stretch>
@@ -590,28 +651,34 @@
           <w:bCs/>
         </w:rPr>
       </w:pPr>
-    </w:p>
-    <w:p>
-      <w:pPr>
-        <w:rPr>
-          <w:b/>
-          <w:bCs/>
-        </w:rPr>
-      </w:pPr>
-    </w:p>
-    <w:p>
-      <w:pPr>
-        <w:rPr>
-          <w:b/>
-          <w:bCs/>
-        </w:rPr>
-      </w:pPr>
-      <w:r>
-        <w:rPr>
-          <w:b/>
-          <w:bCs/>
-        </w:rPr>
-        <w:lastRenderedPageBreak/>
+      <w:r>
+        <w:rPr>
+          <w:b/>
+          <w:bCs/>
+        </w:rPr>
+        <w:t xml:space="preserve">Examples: - </w:t>
+      </w:r>
+    </w:p>
+    <w:p>
+      <w:pPr>
+        <w:rPr>
+          <w:b/>
+          <w:bCs/>
+        </w:rPr>
+      </w:pPr>
+    </w:p>
+    <w:p>
+      <w:pPr>
+        <w:rPr>
+          <w:b/>
+          <w:bCs/>
+        </w:rPr>
+      </w:pPr>
+      <w:r>
+        <w:rPr>
+          <w:b/>
+          <w:bCs/>
+        </w:rPr>
         <w:t>Need for Cloud Computing</w:t>
       </w:r>
     </w:p>
@@ -738,18 +805,20 @@
       </w:r>
     </w:p>
     <w:p/>
-    <w:p>
-      <w:pPr>
-        <w:rPr>
-          <w:b/>
-          <w:bCs/>
-        </w:rPr>
-      </w:pPr>
-      <w:r>
-        <w:rPr>
-          <w:b/>
-          <w:bCs/>
-        </w:rPr>
+    <w:p/>
+    <w:p>
+      <w:pPr>
+        <w:rPr>
+          <w:b/>
+          <w:bCs/>
+        </w:rPr>
+      </w:pPr>
+      <w:r>
+        <w:rPr>
+          <w:b/>
+          <w:bCs/>
+        </w:rPr>
+        <w:lastRenderedPageBreak/>
         <w:t xml:space="preserve">Question: - </w:t>
       </w:r>
       <w:r>
@@ -779,6 +848,7 @@
         <w:rPr>
           <w:b/>
           <w:bCs/>
+          <w:noProof/>
         </w:rPr>
         <w:drawing>
           <wp:inline distT="0" distB="0" distL="0" distR="0" wp14:anchorId="208254DB" wp14:editId="56BA5FA2">
@@ -796,7 +866,7 @@
                     <pic:cNvPicPr/>
                   </pic:nvPicPr>
                   <pic:blipFill>
-                    <a:blip r:embed="rId6"/>
+                    <a:blip r:embed="rId7"/>
                     <a:stretch>
                       <a:fillRect/>
                     </a:stretch>
@@ -853,7 +923,6 @@
           <w:b/>
           <w:bCs/>
         </w:rPr>
-        <w:lastRenderedPageBreak/>
         <w:t xml:space="preserve">Evolution of Cloud Computing </w:t>
       </w:r>
     </w:p>
@@ -934,7 +1003,15 @@
         <w:t>Client-Server Computing (1990s)</w:t>
       </w:r>
       <w:r>
-        <w:t xml:space="preserve"> – Clients access data and services from a central server.</w:t>
+        <w:t xml:space="preserve"> – </w:t>
+      </w:r>
+      <w:proofErr w:type="gramStart"/>
+      <w:r>
+        <w:t>Clients</w:t>
+      </w:r>
+      <w:proofErr w:type="gramEnd"/>
+      <w:r>
+        <w:t xml:space="preserve"> access data and services from a central server.</w:t>
       </w:r>
       <w:r>
         <w:br/>
@@ -1061,6 +1138,7 @@
           <w:b/>
           <w:bCs/>
         </w:rPr>
+        <w:lastRenderedPageBreak/>
         <w:t>Distributed Computing</w:t>
       </w:r>
       <w:r>
@@ -1177,22 +1255,622 @@
     </w:p>
     <w:p/>
     <w:p/>
-    <w:p>
-      <w:pPr>
-        <w:rPr>
-          <w:b/>
-          <w:bCs/>
-        </w:rPr>
-      </w:pPr>
-    </w:p>
-    <w:p>
-      <w:pPr>
-        <w:rPr>
-          <w:b/>
-          <w:bCs/>
-        </w:rPr>
-      </w:pPr>
-    </w:p>
+    <w:p/>
+    <w:p/>
+    <w:p/>
+    <w:p/>
+    <w:p>
+      <w:pPr>
+        <w:rPr>
+          <w:b/>
+          <w:bCs/>
+        </w:rPr>
+      </w:pPr>
+      <w:r>
+        <w:rPr>
+          <w:b/>
+          <w:bCs/>
+        </w:rPr>
+        <w:t xml:space="preserve">Date: - </w:t>
+      </w:r>
+      <w:r>
+        <w:rPr>
+          <w:b/>
+          <w:bCs/>
+        </w:rPr>
+        <w:t>Lecture 2 – 13/07/2026</w:t>
+      </w:r>
+    </w:p>
+    <w:p>
+      <w:pPr>
+        <w:rPr>
+          <w:b/>
+          <w:bCs/>
+        </w:rPr>
+      </w:pPr>
+      <w:r>
+        <w:rPr>
+          <w:b/>
+          <w:bCs/>
+        </w:rPr>
+        <w:t>Revision of 1</w:t>
+      </w:r>
+      <w:r>
+        <w:rPr>
+          <w:b/>
+          <w:bCs/>
+          <w:vertAlign w:val="superscript"/>
+        </w:rPr>
+        <w:t>st</w:t>
+      </w:r>
+      <w:r>
+        <w:rPr>
+          <w:b/>
+          <w:bCs/>
+        </w:rPr>
+        <w:t xml:space="preserve"> lecture.</w:t>
+      </w:r>
+    </w:p>
+    <w:p>
+      <w:pPr>
+        <w:rPr>
+          <w:b/>
+          <w:bCs/>
+        </w:rPr>
+      </w:pPr>
+    </w:p>
+    <w:p>
+      <w:pPr>
+        <w:rPr>
+          <w:b/>
+          <w:bCs/>
+        </w:rPr>
+      </w:pPr>
+      <w:r>
+        <w:rPr>
+          <w:b/>
+          <w:bCs/>
+        </w:rPr>
+        <w:t>Q. Choose application/company and find out who are their providers</w:t>
+      </w:r>
+    </w:p>
+    <w:p>
+      <w:pPr>
+        <w:rPr>
+          <w:b/>
+          <w:bCs/>
+        </w:rPr>
+      </w:pPr>
+      <w:r>
+        <w:rPr>
+          <w:b/>
+          <w:bCs/>
+        </w:rPr>
+        <w:t>Answer: - Applications and providers</w:t>
+      </w:r>
+    </w:p>
+    <w:p>
+      <w:pPr>
+        <w:rPr>
+          <w:b/>
+          <w:bCs/>
+        </w:rPr>
+      </w:pPr>
+      <w:r>
+        <w:rPr>
+          <w:b/>
+          <w:bCs/>
+        </w:rPr>
+        <w:br/>
+        <w:t>Spotify – Google cloud</w:t>
+      </w:r>
+    </w:p>
+    <w:p>
+      <w:pPr>
+        <w:rPr>
+          <w:b/>
+          <w:bCs/>
+        </w:rPr>
+      </w:pPr>
+      <w:r>
+        <w:rPr>
+          <w:b/>
+          <w:bCs/>
+        </w:rPr>
+        <w:t>WhatsApp/Instagram/Facebook – Meta data</w:t>
+      </w:r>
+    </w:p>
+    <w:p>
+      <w:pPr>
+        <w:rPr>
+          <w:b/>
+          <w:bCs/>
+        </w:rPr>
+      </w:pPr>
+      <w:r>
+        <w:rPr>
+          <w:b/>
+          <w:bCs/>
+        </w:rPr>
+        <w:t>Netflix/Amazon/Amazon Prime</w:t>
+      </w:r>
+      <w:r>
+        <w:rPr>
+          <w:b/>
+          <w:bCs/>
+        </w:rPr>
+        <w:t>/</w:t>
+      </w:r>
+      <w:r>
+        <w:rPr>
+          <w:b/>
+          <w:bCs/>
+        </w:rPr>
+        <w:t>Snapchat (</w:t>
+      </w:r>
+      <w:r>
+        <w:rPr>
+          <w:b/>
+          <w:bCs/>
+        </w:rPr>
+        <w:t>GCP)</w:t>
+      </w:r>
+      <w:r>
+        <w:rPr>
+          <w:b/>
+          <w:bCs/>
+        </w:rPr>
+        <w:t xml:space="preserve"> – Amazon (AWS)</w:t>
+      </w:r>
+    </w:p>
+    <w:p>
+      <w:pPr>
+        <w:rPr>
+          <w:b/>
+          <w:bCs/>
+        </w:rPr>
+      </w:pPr>
+      <w:r>
+        <w:rPr>
+          <w:b/>
+          <w:bCs/>
+        </w:rPr>
+        <w:t>X/twitter – Private Provider/ Their own provider/Their own servers</w:t>
+      </w:r>
+    </w:p>
+    <w:p>
+      <w:pPr>
+        <w:rPr>
+          <w:b/>
+          <w:bCs/>
+        </w:rPr>
+      </w:pPr>
+    </w:p>
+    <w:p>
+      <w:pPr>
+        <w:rPr>
+          <w:b/>
+          <w:bCs/>
+        </w:rPr>
+      </w:pPr>
+      <w:r>
+        <w:rPr>
+          <w:b/>
+          <w:bCs/>
+        </w:rPr>
+        <w:t xml:space="preserve">Practical session (small) using </w:t>
+      </w:r>
+      <w:hyperlink r:id="rId8" w:history="1">
+        <w:r>
+          <w:rPr>
+            <w:rStyle w:val="Hyperlink"/>
+            <w:b/>
+            <w:bCs/>
+          </w:rPr>
+          <w:t>https://shell.cloud.google.com</w:t>
+        </w:r>
+      </w:hyperlink>
+      <w:r>
+        <w:rPr>
+          <w:b/>
+          <w:bCs/>
+        </w:rPr>
+        <w:t xml:space="preserve"> </w:t>
+      </w:r>
+    </w:p>
+    <w:p>
+      <w:pPr>
+        <w:rPr>
+          <w:b/>
+          <w:bCs/>
+        </w:rPr>
+      </w:pPr>
+    </w:p>
+    <w:p>
+      <w:r>
+        <w:rPr>
+          <w:noProof/>
+        </w:rPr>
+        <w:lastRenderedPageBreak/>
+        <w:drawing>
+          <wp:inline distT="0" distB="0" distL="0" distR="0" wp14:anchorId="436C7DD4" wp14:editId="252A3BB0">
+            <wp:extent cx="5943600" cy="3446145"/>
+            <wp:effectExtent l="0" t="0" r="0" b="1905"/>
+            <wp:docPr id="143034724" name="Picture 1"/>
+            <wp:cNvGraphicFramePr>
+              <a:graphicFrameLocks xmlns:a="http://schemas.openxmlformats.org/drawingml/2006/main" noChangeAspect="1"/>
+            </wp:cNvGraphicFramePr>
+            <a:graphic xmlns:a="http://schemas.openxmlformats.org/drawingml/2006/main">
+              <a:graphicData uri="http://schemas.openxmlformats.org/drawingml/2006/picture">
+                <pic:pic xmlns:pic="http://schemas.openxmlformats.org/drawingml/2006/picture">
+                  <pic:nvPicPr>
+                    <pic:cNvPr id="143034724" name=""/>
+                    <pic:cNvPicPr/>
+                  </pic:nvPicPr>
+                  <pic:blipFill>
+                    <a:blip r:embed="rId9"/>
+                    <a:stretch>
+                      <a:fillRect/>
+                    </a:stretch>
+                  </pic:blipFill>
+                  <pic:spPr>
+                    <a:xfrm>
+                      <a:off x="0" y="0"/>
+                      <a:ext cx="5943600" cy="3446145"/>
+                    </a:xfrm>
+                    <a:prstGeom prst="rect">
+                      <a:avLst/>
+                    </a:prstGeom>
+                  </pic:spPr>
+                </pic:pic>
+              </a:graphicData>
+            </a:graphic>
+          </wp:inline>
+        </w:drawing>
+      </w:r>
+    </w:p>
+    <w:p>
+      <w:r>
+        <w:rPr>
+          <w:noProof/>
+        </w:rPr>
+        <w:drawing>
+          <wp:inline distT="0" distB="0" distL="0" distR="0" wp14:anchorId="67674F7D" wp14:editId="5296DE64">
+            <wp:extent cx="5943600" cy="3367405"/>
+            <wp:effectExtent l="0" t="0" r="0" b="4445"/>
+            <wp:docPr id="1168600802" name="Picture 1"/>
+            <wp:cNvGraphicFramePr>
+              <a:graphicFrameLocks xmlns:a="http://schemas.openxmlformats.org/drawingml/2006/main" noChangeAspect="1"/>
+            </wp:cNvGraphicFramePr>
+            <a:graphic xmlns:a="http://schemas.openxmlformats.org/drawingml/2006/main">
+              <a:graphicData uri="http://schemas.openxmlformats.org/drawingml/2006/picture">
+                <pic:pic xmlns:pic="http://schemas.openxmlformats.org/drawingml/2006/picture">
+                  <pic:nvPicPr>
+                    <pic:cNvPr id="1168600802" name=""/>
+                    <pic:cNvPicPr/>
+                  </pic:nvPicPr>
+                  <pic:blipFill>
+                    <a:blip r:embed="rId10"/>
+                    <a:stretch>
+                      <a:fillRect/>
+                    </a:stretch>
+                  </pic:blipFill>
+                  <pic:spPr>
+                    <a:xfrm>
+                      <a:off x="0" y="0"/>
+                      <a:ext cx="5943600" cy="3367405"/>
+                    </a:xfrm>
+                    <a:prstGeom prst="rect">
+                      <a:avLst/>
+                    </a:prstGeom>
+                  </pic:spPr>
+                </pic:pic>
+              </a:graphicData>
+            </a:graphic>
+          </wp:inline>
+        </w:drawing>
+      </w:r>
+    </w:p>
+    <w:p/>
+    <w:p/>
+    <w:p/>
+    <w:p/>
+    <w:p>
+      <w:pPr>
+        <w:rPr>
+          <w:b/>
+          <w:bCs/>
+        </w:rPr>
+      </w:pPr>
+      <w:r>
+        <w:rPr>
+          <w:b/>
+          <w:bCs/>
+        </w:rPr>
+        <w:lastRenderedPageBreak/>
+        <w:t>Lecture 3: - 16/07/2026</w:t>
+      </w:r>
+    </w:p>
+    <w:p>
+      <w:pPr>
+        <w:rPr>
+          <w:b/>
+          <w:bCs/>
+        </w:rPr>
+      </w:pPr>
+    </w:p>
+    <w:p>
+      <w:pPr>
+        <w:rPr>
+          <w:b/>
+          <w:bCs/>
+        </w:rPr>
+      </w:pPr>
+      <w:r>
+        <w:rPr>
+          <w:b/>
+          <w:bCs/>
+        </w:rPr>
+        <w:t>Recollection of topics from last 2 lectures</w:t>
+      </w:r>
+    </w:p>
+    <w:p>
+      <w:pPr>
+        <w:rPr>
+          <w:b/>
+          <w:bCs/>
+        </w:rPr>
+      </w:pPr>
+      <w:r>
+        <w:rPr>
+          <w:b/>
+          <w:bCs/>
+        </w:rPr>
+        <w:t xml:space="preserve">Unit 2: - </w:t>
+      </w:r>
+      <w:r>
+        <w:rPr>
+          <w:b/>
+          <w:bCs/>
+        </w:rPr>
+        <w:t>Cloud Services Models</w:t>
+      </w:r>
+    </w:p>
+    <w:p>
+      <w:pPr>
+        <w:rPr>
+          <w:b/>
+          <w:bCs/>
+        </w:rPr>
+      </w:pPr>
+      <w:r>
+        <w:rPr>
+          <w:b/>
+          <w:bCs/>
+        </w:rPr>
+        <w:t xml:space="preserve">Services offered by cloud services (Cloud Services Models): - </w:t>
+      </w:r>
+    </w:p>
+    <w:p>
+      <w:r>
+        <w:t xml:space="preserve"> 1.IaaS (Infrastructure)</w:t>
+      </w:r>
+    </w:p>
+    <w:p>
+      <w:r>
+        <w:t xml:space="preserve"> 2.PaaS (Platform)</w:t>
+      </w:r>
+    </w:p>
+    <w:p>
+      <w:r>
+        <w:t xml:space="preserve"> 3.SaaD (Software)</w:t>
+      </w:r>
+    </w:p>
+    <w:p>
+      <w:r>
+        <w:t xml:space="preserve"> 4.FaaS (Functio</w:t>
+      </w:r>
+      <w:r>
+        <w:t>n</w:t>
+      </w:r>
+      <w:r>
+        <w:t>)</w:t>
+      </w:r>
+    </w:p>
+    <w:p/>
+    <w:p>
+      <w:r>
+        <w:rPr>
+          <w:b/>
+          <w:bCs/>
+        </w:rPr>
+        <w:t>Definition: -</w:t>
+      </w:r>
+      <w:r>
+        <w:t xml:space="preserve"> Think of Cloud Service Models as </w:t>
+      </w:r>
+      <w:r>
+        <w:rPr>
+          <w:b/>
+          <w:bCs/>
+        </w:rPr>
+        <w:t>different ways of renting IT services</w:t>
+      </w:r>
+      <w:r>
+        <w:t xml:space="preserve"> according to your needs.</w:t>
+      </w:r>
+    </w:p>
+    <w:p/>
+    <w:p>
+      <w:pPr>
+        <w:rPr>
+          <w:b/>
+          <w:bCs/>
+        </w:rPr>
+      </w:pPr>
+      <w:r>
+        <w:rPr>
+          <w:b/>
+          <w:bCs/>
+        </w:rPr>
+        <w:t>Q. Why do we need different services models?</w:t>
+      </w:r>
+    </w:p>
+    <w:p>
+      <w:pPr>
+        <w:rPr>
+          <w:b/>
+          <w:bCs/>
+        </w:rPr>
+      </w:pPr>
+      <w:r>
+        <w:rPr>
+          <w:b/>
+          <w:bCs/>
+        </w:rPr>
+        <w:t xml:space="preserve">User/Requirement Table </w:t>
+      </w:r>
+    </w:p>
+    <w:p>
+      <w:pPr>
+        <w:rPr>
+          <w:b/>
+          <w:bCs/>
+        </w:rPr>
+      </w:pPr>
+      <w:r>
+        <w:rPr>
+          <w:b/>
+          <w:bCs/>
+        </w:rPr>
+        <w:t xml:space="preserve">l. </w:t>
+      </w:r>
+      <w:r>
+        <w:rPr>
+          <w:b/>
+          <w:bCs/>
+        </w:rPr>
+        <w:t xml:space="preserve">Everyday Analogy </w:t>
+      </w:r>
+      <w:r>
+        <w:rPr>
+          <w:b/>
+          <w:bCs/>
+        </w:rPr>
+        <w:t>–</w:t>
+      </w:r>
+      <w:r>
+        <w:rPr>
+          <w:b/>
+          <w:bCs/>
+        </w:rPr>
+        <w:t xml:space="preserve"> Transportation</w:t>
+      </w:r>
+    </w:p>
+    <w:p>
+      <w:pPr>
+        <w:rPr>
+          <w:b/>
+          <w:bCs/>
+        </w:rPr>
+      </w:pPr>
+      <w:r>
+        <w:rPr>
+          <w:b/>
+          <w:bCs/>
+        </w:rPr>
+        <w:t xml:space="preserve">ll. </w:t>
+      </w:r>
+      <w:r>
+        <w:rPr>
+          <w:b/>
+          <w:bCs/>
+        </w:rPr>
+        <w:t>Evolution of Cloud Services Models</w:t>
+      </w:r>
+    </w:p>
+    <w:p>
+      <w:pPr>
+        <w:rPr>
+          <w:b/>
+          <w:bCs/>
+        </w:rPr>
+      </w:pPr>
+      <w:proofErr w:type="spellStart"/>
+      <w:r>
+        <w:rPr>
+          <w:b/>
+          <w:bCs/>
+        </w:rPr>
+        <w:t>lll</w:t>
+      </w:r>
+      <w:proofErr w:type="spellEnd"/>
+      <w:r>
+        <w:rPr>
+          <w:b/>
+          <w:bCs/>
+        </w:rPr>
+        <w:t>. Overview of Cloud Service Models</w:t>
+      </w:r>
+    </w:p>
+    <w:p>
+      <w:pPr>
+        <w:rPr>
+          <w:b/>
+          <w:bCs/>
+        </w:rPr>
+      </w:pPr>
+      <w:r>
+        <w:rPr>
+          <w:b/>
+          <w:bCs/>
+        </w:rPr>
+        <w:t>IV. Shared responsibility Model</w:t>
+      </w:r>
+    </w:p>
+    <w:p>
+      <w:pPr>
+        <w:rPr>
+          <w:b/>
+          <w:bCs/>
+        </w:rPr>
+      </w:pPr>
+      <w:r>
+        <w:rPr>
+          <w:b/>
+          <w:bCs/>
+        </w:rPr>
+        <w:t>Who manages what</w:t>
+      </w:r>
+    </w:p>
+    <w:p>
+      <w:pPr>
+        <w:rPr>
+          <w:b/>
+          <w:bCs/>
+        </w:rPr>
+      </w:pPr>
+    </w:p>
+    <w:p>
+      <w:pPr>
+        <w:rPr>
+          <w:b/>
+          <w:bCs/>
+        </w:rPr>
+      </w:pPr>
+    </w:p>
+    <w:p/>
+    <w:p/>
+    <w:p/>
+    <w:p>
+      <w:pPr>
+        <w:rPr>
+          <w:b/>
+          <w:bCs/>
+        </w:rPr>
+      </w:pPr>
+    </w:p>
+    <w:p/>
     <w:p/>
     <w:sectPr>
       <w:pgSz w:w="12240" w:h="15840"/>
@@ -1206,6 +1884,11 @@
 
 <file path=word/numbering.xml><?xml version="1.0" encoding="utf-8"?>
 <w:numbering xmlns:wpc="http://schemas.microsoft.com/office/word/2010/wordprocessingCanvas" xmlns:cx="http://schemas.microsoft.com/office/drawing/2014/chartex" xmlns:cx1="http://schemas.microsoft.com/office/drawing/2015/9/8/chartex" xmlns:cx2="http://schemas.microsoft.com/office/drawing/2015/10/21/chartex" xmlns:cx3="http://schemas.microsoft.com/office/drawing/2016/5/9/chartex" xmlns:cx4="http://schemas.microsoft.com/office/drawing/2016/5/10/chartex" xmlns:cx5="http://schemas.microsoft.com/office/drawing/2016/5/11/chartex" xmlns:cx6="http://schemas.microsoft.com/office/drawing/2016/5/12/chartex" xmlns:cx7="http://schemas.microsoft.com/office/drawing/2016/5/13/chartex" xmlns:cx8="http://schemas.microsoft.com/office/drawing/2016/5/14/chartex" xmlns:mc="http://schemas.openxmlformats.org/markup-compatibility/2006" xmlns:aink="http://schemas.microsoft.com/office/drawing/2016/ink" xmlns:am3d="http://schemas.microsoft.com/office/drawing/2017/model3d" xmlns:o="urn:schemas-microsoft-com:office:office" xmlns:oel="http://schemas.microsoft.com/office/2019/extlst" xmlns:r="http://schemas.openxmlformats.org/officeDocument/2006/relationships" xmlns:m="http://schemas.openxmlformats.org/officeDocument/2006/math" xmlns:v="urn:schemas-microsoft-com:vml" xmlns:wp14="http://schemas.microsoft.com/office/word/2010/wordprocessingDrawing" xmlns:wp="http://schemas.openxmlformats.org/drawingml/2006/wordprocessingDrawing" xmlns:w10="urn:schemas-microsoft-com:office:word" xmlns:w="http://schemas.openxmlformats.org/wordprocessingml/2006/main" xmlns:w14="http://schemas.microsoft.com/office/word/2010/wordml" xmlns:w15="http://schemas.microsoft.com/office/word/2012/wordml" xmlns:w16cex="http://schemas.microsoft.com/office/word/2018/wordml/cex" xmlns:w16cid="http://schemas.microsoft.com/office/word/2016/wordml/cid" xmlns:w16="http://schemas.microsoft.com/office/word/2018/wordml" xmlns:w16du="http://schemas.microsoft.com/office/word/2023/wordml/word16du" xmlns:w16sdtdh="http://schemas.microsoft.com/office/word/2020/wordml/sdtdatahash" xmlns:w16sdtfl="http://schemas.microsoft.com/office/word/2024/wordml/sdtformatlock" xmlns:w16se="http://schemas.microsoft.com/office/word/2015/wordml/symex" xmlns:wpg="http://schemas.microsoft.com/office/word/2010/wordprocessingGroup" xmlns:wpi="http://schemas.microsoft.com/office/word/2010/wordprocessingInk" xmlns:wne="http://schemas.microsoft.com/office/word/2006/wordml" xmlns:wps="http://schemas.microsoft.com/office/word/2010/wordprocessingShape" mc:Ignorable="w14 w15 w16se w16cid w16 w16cex w16sdtdh w16sdtfl w16du wp14">
+  <w:numPicBullet w:numPicBulletId="0">
+    <w:pict>
+      <v:rect id="_x0000_i1025" style="width:0;height:1.5pt" o:hralign="center" o:bullet="t" o:hrstd="t" o:hr="t" fillcolor="#a0a0a0" stroked="f"/>
+    </w:pict>
+  </w:numPicBullet>
   <w:abstractNum w:abstractNumId="0" w15:restartNumberingAfterBreak="0">
     <w:nsid w:val="073A6757"/>
     <w:multiLevelType w:val="multilevel"/>
@@ -3992,6 +4675,7 @@
   <w:style w:type="character" w:default="1" w:styleId="DefaultParagraphFont">
     <w:name w:val="Default Paragraph Font"/>
     <w:uiPriority w:val="1"/>
+    <w:semiHidden/>
     <w:unhideWhenUsed/>
   </w:style>
   <w:style w:type="table" w:default="1" w:styleId="TableNormal">
@@ -4305,6 +4989,29 @@
       <w:spacing w:val="5"/>
     </w:rPr>
   </w:style>
+  <w:style w:type="character" w:styleId="Hyperlink">
+    <w:name w:val="Hyperlink"/>
+    <w:basedOn w:val="DefaultParagraphFont"/>
+    <w:uiPriority w:val="99"/>
+    <w:unhideWhenUsed/>
+    <w:rsid w:val="000F7AF7"/>
+    <w:rPr>
+      <w:color w:val="0563C1" w:themeColor="hyperlink"/>
+      <w:u w:val="single"/>
+    </w:rPr>
+  </w:style>
+  <w:style w:type="character" w:styleId="UnresolvedMention">
+    <w:name w:val="Unresolved Mention"/>
+    <w:basedOn w:val="DefaultParagraphFont"/>
+    <w:uiPriority w:val="99"/>
+    <w:semiHidden/>
+    <w:unhideWhenUsed/>
+    <w:rsid w:val="000F7AF7"/>
+    <w:rPr>
+      <w:color w:val="605E5C"/>
+      <w:shd w:val="clear" w:color="auto" w:fill="E1DFDD"/>
+    </w:rPr>
+  </w:style>
 </w:styles>
 </file>
 

</xml_diff>

<commit_message>
Word Notes updated Up-TO-Date
</commit_message>
<xml_diff>
--- a/TYBCA/Introduction To Cloud Computing/Lecture Notes.docx
+++ b/TYBCA/Introduction To Cloud Computing/Lecture Notes.docx
@@ -1781,12 +1781,21 @@
           <w:bCs/>
         </w:rPr>
       </w:pPr>
-      <w:r>
-        <w:rPr>
-          <w:b/>
-          <w:bCs/>
-        </w:rPr>
-        <w:t>lll. Overview of Cloud Service Models</w:t>
+      <w:proofErr w:type="spellStart"/>
+      <w:r>
+        <w:rPr>
+          <w:b/>
+          <w:bCs/>
+        </w:rPr>
+        <w:t>lll</w:t>
+      </w:r>
+      <w:proofErr w:type="spellEnd"/>
+      <w:r>
+        <w:rPr>
+          <w:b/>
+          <w:bCs/>
+        </w:rPr>
+        <w:t>. Overview of Cloud Service Models</w:t>
       </w:r>
     </w:p>
     <w:p>
@@ -1945,6 +1954,635 @@
       </w:pPr>
     </w:p>
     <w:p/>
+    <w:p>
+      <w:pPr>
+        <w:rPr>
+          <w:b/>
+          <w:bCs/>
+        </w:rPr>
+      </w:pPr>
+      <w:r>
+        <w:rPr>
+          <w:b/>
+          <w:bCs/>
+        </w:rPr>
+        <w:t>Lecture 5: -</w:t>
+      </w:r>
+      <w:r>
+        <w:rPr>
+          <w:b/>
+          <w:bCs/>
+        </w:rPr>
+        <w:t xml:space="preserve"> 23/07/2026</w:t>
+      </w:r>
+    </w:p>
+    <w:p>
+      <w:pPr>
+        <w:rPr>
+          <w:b/>
+          <w:bCs/>
+        </w:rPr>
+      </w:pPr>
+      <w:r>
+        <w:rPr>
+          <w:b/>
+          <w:bCs/>
+        </w:rPr>
+        <w:t xml:space="preserve">Types of computer/computing powers: - </w:t>
+      </w:r>
+    </w:p>
+    <w:p>
+      <w:pPr>
+        <w:rPr>
+          <w:b/>
+          <w:bCs/>
+        </w:rPr>
+      </w:pPr>
+      <w:r>
+        <w:rPr>
+          <w:b/>
+          <w:bCs/>
+        </w:rPr>
+        <w:t>1.Mini/micro computer</w:t>
+      </w:r>
+    </w:p>
+    <w:p>
+      <w:pPr>
+        <w:rPr>
+          <w:b/>
+          <w:bCs/>
+        </w:rPr>
+      </w:pPr>
+      <w:r>
+        <w:rPr>
+          <w:b/>
+          <w:bCs/>
+        </w:rPr>
+        <w:t>2.MainFrame Computer</w:t>
+      </w:r>
+    </w:p>
+    <w:p>
+      <w:pPr>
+        <w:rPr>
+          <w:b/>
+          <w:bCs/>
+        </w:rPr>
+      </w:pPr>
+      <w:r>
+        <w:rPr>
+          <w:b/>
+          <w:bCs/>
+        </w:rPr>
+        <w:t>3.SuperComputers</w:t>
+      </w:r>
+    </w:p>
+    <w:p>
+      <w:pPr>
+        <w:rPr>
+          <w:b/>
+          <w:bCs/>
+        </w:rPr>
+      </w:pPr>
+    </w:p>
+    <w:tbl>
+      <w:tblPr>
+        <w:tblW w:w="0" w:type="auto"/>
+        <w:tblCellSpacing w:w="15" w:type="dxa"/>
+        <w:tblCellMar>
+          <w:top w:w="15" w:type="dxa"/>
+          <w:left w:w="15" w:type="dxa"/>
+          <w:bottom w:w="15" w:type="dxa"/>
+          <w:right w:w="15" w:type="dxa"/>
+        </w:tblCellMar>
+        <w:tblLook w:val="04A0" w:firstRow="1" w:lastRow="0" w:firstColumn="1" w:lastColumn="0" w:noHBand="0" w:noVBand="1"/>
+      </w:tblPr>
+      <w:tblGrid>
+        <w:gridCol w:w="1904"/>
+        <w:gridCol w:w="2257"/>
+        <w:gridCol w:w="2785"/>
+        <w:gridCol w:w="2414"/>
+      </w:tblGrid>
+      <w:tr>
+        <w:trPr>
+          <w:tblHeader/>
+          <w:tblCellSpacing w:w="15" w:type="dxa"/>
+        </w:trPr>
+        <w:tc>
+          <w:tcPr>
+            <w:tcW w:w="0" w:type="auto"/>
+            <w:vAlign w:val="center"/>
+            <w:hideMark/>
+          </w:tcPr>
+          <w:p>
+            <w:pPr>
+              <w:rPr>
+                <w:b/>
+                <w:bCs/>
+              </w:rPr>
+            </w:pPr>
+            <w:r>
+              <w:rPr>
+                <w:b/>
+                <w:bCs/>
+              </w:rPr>
+              <w:t>Feature</w:t>
+            </w:r>
+          </w:p>
+        </w:tc>
+        <w:tc>
+          <w:tcPr>
+            <w:tcW w:w="0" w:type="auto"/>
+            <w:vAlign w:val="center"/>
+            <w:hideMark/>
+          </w:tcPr>
+          <w:p>
+            <w:pPr>
+              <w:rPr>
+                <w:b/>
+                <w:bCs/>
+              </w:rPr>
+            </w:pPr>
+            <w:r>
+              <w:rPr>
+                <w:b/>
+                <w:bCs/>
+              </w:rPr>
+              <w:t>Supercomputer</w:t>
+            </w:r>
+          </w:p>
+        </w:tc>
+        <w:tc>
+          <w:tcPr>
+            <w:tcW w:w="0" w:type="auto"/>
+            <w:vAlign w:val="center"/>
+            <w:hideMark/>
+          </w:tcPr>
+          <w:p>
+            <w:pPr>
+              <w:rPr>
+                <w:b/>
+                <w:bCs/>
+              </w:rPr>
+            </w:pPr>
+            <w:r>
+              <w:rPr>
+                <w:b/>
+                <w:bCs/>
+              </w:rPr>
+              <w:t>Mainframe Computer</w:t>
+            </w:r>
+          </w:p>
+        </w:tc>
+        <w:tc>
+          <w:tcPr>
+            <w:tcW w:w="0" w:type="auto"/>
+            <w:vAlign w:val="center"/>
+            <w:hideMark/>
+          </w:tcPr>
+          <w:p>
+            <w:pPr>
+              <w:rPr>
+                <w:b/>
+                <w:bCs/>
+              </w:rPr>
+            </w:pPr>
+            <w:r>
+              <w:rPr>
+                <w:b/>
+                <w:bCs/>
+              </w:rPr>
+              <w:t>Minicomputer</w:t>
+            </w:r>
+          </w:p>
+        </w:tc>
+      </w:tr>
+      <w:tr>
+        <w:trPr>
+          <w:tblCellSpacing w:w="15" w:type="dxa"/>
+        </w:trPr>
+        <w:tc>
+          <w:tcPr>
+            <w:tcW w:w="0" w:type="auto"/>
+            <w:vAlign w:val="center"/>
+            <w:hideMark/>
+          </w:tcPr>
+          <w:p>
+            <w:r>
+              <w:t>Relative computing power</w:t>
+            </w:r>
+          </w:p>
+        </w:tc>
+        <w:tc>
+          <w:tcPr>
+            <w:tcW w:w="0" w:type="auto"/>
+            <w:vAlign w:val="center"/>
+            <w:hideMark/>
+          </w:tcPr>
+          <w:p>
+            <w:r>
+              <w:t>Highest</w:t>
+            </w:r>
+          </w:p>
+        </w:tc>
+        <w:tc>
+          <w:tcPr>
+            <w:tcW w:w="0" w:type="auto"/>
+            <w:vAlign w:val="center"/>
+            <w:hideMark/>
+          </w:tcPr>
+          <w:p>
+            <w:r>
+              <w:t>Very high</w:t>
+            </w:r>
+          </w:p>
+        </w:tc>
+        <w:tc>
+          <w:tcPr>
+            <w:tcW w:w="0" w:type="auto"/>
+            <w:vAlign w:val="center"/>
+            <w:hideMark/>
+          </w:tcPr>
+          <w:p>
+            <w:r>
+              <w:t>Moderate</w:t>
+            </w:r>
+          </w:p>
+        </w:tc>
+      </w:tr>
+      <w:tr>
+        <w:trPr>
+          <w:tblCellSpacing w:w="15" w:type="dxa"/>
+        </w:trPr>
+        <w:tc>
+          <w:tcPr>
+            <w:tcW w:w="0" w:type="auto"/>
+            <w:vAlign w:val="center"/>
+            <w:hideMark/>
+          </w:tcPr>
+          <w:p>
+            <w:r>
+              <w:t>Primary purpose</w:t>
+            </w:r>
+          </w:p>
+        </w:tc>
+        <w:tc>
+          <w:tcPr>
+            <w:tcW w:w="0" w:type="auto"/>
+            <w:vAlign w:val="center"/>
+            <w:hideMark/>
+          </w:tcPr>
+          <w:p>
+            <w:r>
+              <w:t>Massive scientific calculations</w:t>
+            </w:r>
+          </w:p>
+        </w:tc>
+        <w:tc>
+          <w:tcPr>
+            <w:tcW w:w="0" w:type="auto"/>
+            <w:vAlign w:val="center"/>
+            <w:hideMark/>
+          </w:tcPr>
+          <w:p>
+            <w:r>
+              <w:t>Large-scale transaction processing</w:t>
+            </w:r>
+          </w:p>
+        </w:tc>
+        <w:tc>
+          <w:tcPr>
+            <w:tcW w:w="0" w:type="auto"/>
+            <w:vAlign w:val="center"/>
+            <w:hideMark/>
+          </w:tcPr>
+          <w:p>
+            <w:r>
+              <w:t>Departmental / mid-size computing</w:t>
+            </w:r>
+          </w:p>
+        </w:tc>
+      </w:tr>
+      <w:tr>
+        <w:trPr>
+          <w:tblCellSpacing w:w="15" w:type="dxa"/>
+        </w:trPr>
+        <w:tc>
+          <w:tcPr>
+            <w:tcW w:w="0" w:type="auto"/>
+            <w:vAlign w:val="center"/>
+            <w:hideMark/>
+          </w:tcPr>
+          <w:p>
+            <w:r>
+              <w:t>Typical users</w:t>
+            </w:r>
+          </w:p>
+        </w:tc>
+        <w:tc>
+          <w:tcPr>
+            <w:tcW w:w="0" w:type="auto"/>
+            <w:vAlign w:val="center"/>
+            <w:hideMark/>
+          </w:tcPr>
+          <w:p>
+            <w:r>
+              <w:t>Research labs, weather centers</w:t>
+            </w:r>
+          </w:p>
+        </w:tc>
+        <w:tc>
+          <w:tcPr>
+            <w:tcW w:w="0" w:type="auto"/>
+            <w:vAlign w:val="center"/>
+            <w:hideMark/>
+          </w:tcPr>
+          <w:p>
+            <w:r>
+              <w:t>Banks, airlines, governments</w:t>
+            </w:r>
+          </w:p>
+        </w:tc>
+        <w:tc>
+          <w:tcPr>
+            <w:tcW w:w="0" w:type="auto"/>
+            <w:vAlign w:val="center"/>
+            <w:hideMark/>
+          </w:tcPr>
+          <w:p>
+            <w:r>
+              <w:t>Universities, small organizations</w:t>
+            </w:r>
+          </w:p>
+        </w:tc>
+      </w:tr>
+      <w:tr>
+        <w:trPr>
+          <w:tblCellSpacing w:w="15" w:type="dxa"/>
+        </w:trPr>
+        <w:tc>
+          <w:tcPr>
+            <w:tcW w:w="0" w:type="auto"/>
+            <w:vAlign w:val="center"/>
+            <w:hideMark/>
+          </w:tcPr>
+          <w:p>
+            <w:r>
+              <w:t>Processing style</w:t>
+            </w:r>
+          </w:p>
+        </w:tc>
+        <w:tc>
+          <w:tcPr>
+            <w:tcW w:w="0" w:type="auto"/>
+            <w:vAlign w:val="center"/>
+            <w:hideMark/>
+          </w:tcPr>
+          <w:p>
+            <w:r>
+              <w:t>Extreme parallel processing</w:t>
+            </w:r>
+          </w:p>
+        </w:tc>
+        <w:tc>
+          <w:tcPr>
+            <w:tcW w:w="0" w:type="auto"/>
+            <w:vAlign w:val="center"/>
+            <w:hideMark/>
+          </w:tcPr>
+          <w:p>
+            <w:r>
+              <w:t>Many simultaneous users and transactions</w:t>
+            </w:r>
+          </w:p>
+        </w:tc>
+        <w:tc>
+          <w:tcPr>
+            <w:tcW w:w="0" w:type="auto"/>
+            <w:vAlign w:val="center"/>
+            <w:hideMark/>
+          </w:tcPr>
+          <w:p>
+            <w:r>
+              <w:t>Multi-user, smaller workload</w:t>
+            </w:r>
+          </w:p>
+        </w:tc>
+      </w:tr>
+      <w:tr>
+        <w:trPr>
+          <w:tblCellSpacing w:w="15" w:type="dxa"/>
+        </w:trPr>
+        <w:tc>
+          <w:tcPr>
+            <w:tcW w:w="0" w:type="auto"/>
+            <w:vAlign w:val="center"/>
+            <w:hideMark/>
+          </w:tcPr>
+          <w:p>
+            <w:r>
+              <w:t>Performance (approx.)</w:t>
+            </w:r>
+          </w:p>
+        </w:tc>
+        <w:tc>
+          <w:tcPr>
+            <w:tcW w:w="0" w:type="auto"/>
+            <w:vAlign w:val="center"/>
+            <w:hideMark/>
+          </w:tcPr>
+          <w:p>
+            <w:proofErr w:type="spellStart"/>
+            <w:r>
+              <w:t>PetaFLOPS</w:t>
+            </w:r>
+            <w:proofErr w:type="spellEnd"/>
+            <w:r>
+              <w:t xml:space="preserve"> to </w:t>
+            </w:r>
+            <w:proofErr w:type="spellStart"/>
+            <w:r>
+              <w:t>ExaFLOPS</w:t>
+            </w:r>
+            <w:proofErr w:type="spellEnd"/>
+          </w:p>
+        </w:tc>
+        <w:tc>
+          <w:tcPr>
+            <w:tcW w:w="0" w:type="auto"/>
+            <w:vAlign w:val="center"/>
+            <w:hideMark/>
+          </w:tcPr>
+          <w:p>
+            <w:r>
+              <w:t>Millions of transactions/sec</w:t>
+            </w:r>
+          </w:p>
+        </w:tc>
+        <w:tc>
+          <w:tcPr>
+            <w:tcW w:w="0" w:type="auto"/>
+            <w:vAlign w:val="center"/>
+            <w:hideMark/>
+          </w:tcPr>
+          <w:p>
+            <w:r>
+              <w:t>Thousands of operations/sec</w:t>
+            </w:r>
+          </w:p>
+        </w:tc>
+      </w:tr>
+      <w:tr>
+        <w:trPr>
+          <w:tblCellSpacing w:w="15" w:type="dxa"/>
+        </w:trPr>
+        <w:tc>
+          <w:tcPr>
+            <w:tcW w:w="0" w:type="auto"/>
+            <w:vAlign w:val="center"/>
+            <w:hideMark/>
+          </w:tcPr>
+          <w:p>
+            <w:r>
+              <w:t>Examples</w:t>
+            </w:r>
+          </w:p>
+        </w:tc>
+        <w:tc>
+          <w:tcPr>
+            <w:tcW w:w="0" w:type="auto"/>
+            <w:vAlign w:val="center"/>
+            <w:hideMark/>
+          </w:tcPr>
+          <w:p>
+            <w:r>
+              <w:t xml:space="preserve">Frontier, </w:t>
+            </w:r>
+            <w:proofErr w:type="spellStart"/>
+            <w:r>
+              <w:t>Fugaku</w:t>
+            </w:r>
+            <w:proofErr w:type="spellEnd"/>
+          </w:p>
+        </w:tc>
+        <w:tc>
+          <w:tcPr>
+            <w:tcW w:w="0" w:type="auto"/>
+            <w:vAlign w:val="center"/>
+            <w:hideMark/>
+          </w:tcPr>
+          <w:p>
+            <w:r>
+              <w:t>IBM z16</w:t>
+            </w:r>
+          </w:p>
+        </w:tc>
+        <w:tc>
+          <w:tcPr>
+            <w:tcW w:w="0" w:type="auto"/>
+            <w:vAlign w:val="center"/>
+            <w:hideMark/>
+          </w:tcPr>
+          <w:p>
+            <w:r>
+              <w:t>DEC VAX, PDP-11</w:t>
+            </w:r>
+          </w:p>
+        </w:tc>
+      </w:tr>
+    </w:tbl>
+    <w:p/>
+    <w:p/>
+    <w:p>
+      <w:pPr>
+        <w:rPr>
+          <w:b/>
+          <w:bCs/>
+        </w:rPr>
+      </w:pPr>
+      <w:r>
+        <w:rPr>
+          <w:b/>
+          <w:bCs/>
+        </w:rPr>
+        <w:lastRenderedPageBreak/>
+        <w:t xml:space="preserve"> </w:t>
+      </w:r>
+      <w:r>
+        <w:rPr>
+          <w:b/>
+          <w:bCs/>
+        </w:rPr>
+        <w:t>Lecture 6: - 27/07/2026</w:t>
+      </w:r>
+    </w:p>
+    <w:p>
+      <w:pPr>
+        <w:rPr>
+          <w:b/>
+          <w:bCs/>
+        </w:rPr>
+      </w:pPr>
+      <w:r>
+        <w:rPr>
+          <w:b/>
+          <w:bCs/>
+        </w:rPr>
+        <w:t>NPTEL course for Cloud Computing.</w:t>
+      </w:r>
+    </w:p>
+    <w:p>
+      <w:pPr>
+        <w:rPr>
+          <w:b/>
+          <w:bCs/>
+        </w:rPr>
+      </w:pPr>
+      <w:r>
+        <w:rPr>
+          <w:b/>
+          <w:bCs/>
+        </w:rPr>
+        <w:t xml:space="preserve">QUIZ: - </w:t>
+      </w:r>
+    </w:p>
+    <w:p>
+      <w:pPr>
+        <w:rPr>
+          <w:b/>
+          <w:bCs/>
+        </w:rPr>
+      </w:pPr>
+      <w:r>
+        <w:rPr>
+          <w:b/>
+          <w:bCs/>
+        </w:rPr>
+        <w:t>Define Cloud Computing</w:t>
+      </w:r>
+    </w:p>
+    <w:p>
+      <w:pPr>
+        <w:rPr>
+          <w:b/>
+          <w:bCs/>
+        </w:rPr>
+      </w:pPr>
+      <w:r>
+        <w:rPr>
+          <w:b/>
+          <w:bCs/>
+        </w:rPr>
+        <w:t xml:space="preserve">List five characteristics </w:t>
+      </w:r>
+    </w:p>
+    <w:p>
+      <w:pPr>
+        <w:rPr>
+          <w:b/>
+          <w:bCs/>
+        </w:rPr>
+      </w:pPr>
+    </w:p>
     <w:p/>
     <w:p/>
     <w:p>

</xml_diff>